<commit_message>
Keep the one-pager readable: no tofu boxes, no split table rows
Calibri has no glyph for the check mark, so every "done" in the timeline
printed as an empty box; the word carries the meaning on its own. Metric rows
now stay whole instead of spilling half a row onto the next page.

Co-Authored-By: Claude Opus 5 <noreply@anthropic.com>
</commit_message>
<xml_diff>
--- a/docs/DiaBite-PRD-One-Page.docx
+++ b/docs/DiaBite-PRD-One-Page.docx
@@ -418,6 +418,7 @@
       </w:tblGrid>
       <w:tr>
         <w:trPr>
+          <w:cantSplit/>
           <w:tblHeader/>
         </w:trPr>
         <w:tc>
@@ -495,6 +496,7 @@
       </w:tr>
       <w:tr>
         <w:trPr>
+          <w:cantSplit/>
           <w:tblHeader w:val="false"/>
         </w:trPr>
         <w:tc>
@@ -589,6 +591,7 @@
       </w:tr>
       <w:tr>
         <w:trPr>
+          <w:cantSplit/>
           <w:tblHeader w:val="false"/>
         </w:trPr>
         <w:tc>
@@ -683,6 +686,7 @@
       </w:tr>
       <w:tr>
         <w:trPr>
+          <w:cantSplit/>
           <w:tblHeader w:val="false"/>
         </w:trPr>
         <w:tc>
@@ -777,6 +781,7 @@
       </w:tr>
       <w:tr>
         <w:trPr>
+          <w:cantSplit/>
           <w:tblHeader w:val="false"/>
         </w:trPr>
         <w:tc>
@@ -861,6 +866,7 @@
       </w:tr>
       <w:tr>
         <w:trPr>
+          <w:cantSplit/>
           <w:tblHeader w:val="false"/>
         </w:trPr>
         <w:tc>
@@ -945,6 +951,7 @@
       </w:tr>
       <w:tr>
         <w:trPr>
+          <w:cantSplit/>
           <w:tblHeader w:val="false"/>
         </w:trPr>
         <w:tc>
@@ -1377,7 +1384,7 @@
           <w:sz w:val="21"/>
           <w:szCs w:val="21"/>
         </w:rPr>
-        <w:t xml:space="preserve"> — environment, engine verified end to end, English UI, design direction and clickable prototype ✅ </w:t>
+        <w:t xml:space="preserve"> — environment, engine verified end to end, English UI, design direction and clickable prototype  </w:t>
       </w:r>
       <w:r>
         <w:rPr>
@@ -1415,7 +1422,7 @@
           <w:sz w:val="21"/>
           <w:szCs w:val="21"/>
         </w:rPr>
-        <w:t xml:space="preserve"> — agent loop end to end on existing seed data; engine deployed as HTTP tools ✅ </w:t>
+        <w:t xml:space="preserve"> — agent loop end to end on existing seed data; engine deployed as HTTP tools  </w:t>
       </w:r>
       <w:r>
         <w:rPr>
@@ -1453,7 +1460,7 @@
           <w:sz w:val="21"/>
           <w:szCs w:val="21"/>
         </w:rPr>
-        <w:t xml:space="preserve"> — verifier and evaluation set ✅ </w:t>
+        <w:t xml:space="preserve"> — verifier and evaluation set  </w:t>
       </w:r>
       <w:r>
         <w:rPr>
@@ -1491,7 +1498,7 @@
           <w:sz w:val="21"/>
           <w:szCs w:val="21"/>
         </w:rPr>
-        <w:t xml:space="preserve"> — visible tool trace ✅ </w:t>
+        <w:t xml:space="preserve"> — visible tool trace  </w:t>
       </w:r>
       <w:r>
         <w:rPr>

</xml_diff>